<commit_message>
fix: right-align pengesahan date, auto-fill ketua/sekretaris names in laporan
- Right-align 'Kotabumi, {{TANGGAL_CETAK}}' paragraph in template
- Add {{NAMA_KETUA}} and {{NAMA_SEKRETARIS}} placeholders in signature table
- Query BiodataKader by jabatan_struktural to fill names automatically
</commit_message>
<xml_diff>
--- a/templates/laporan_template/Template_Laporan.docx
+++ b/templates/laporan_template/Template_Laporan.docx
@@ -1404,6 +1404,7 @@
     <w:p>
       <w:pPr>
         <w:spacing w:before="100" w:after="80"/>
+        <w:jc w:val="right"/>
       </w:pPr>
       <w:r>
         <w:rPr>
@@ -1445,6 +1446,15 @@
       </w:tblGrid>
       <w:tr>
         <w:tc>
+          <w:p>
+            <w:r>
+              <w:rPr>
+                <w:b/>
+                <w:rFonts w:ascii="Times New Roman" w:hAnsi="Times New Roman"/>
+              </w:rPr>
+              <w:t>{{NAMA_KETUA}}</w:t>
+            </w:r>
+          </w:p>
           <w:tcPr>
             <w:tcW w:w="4600" w:type="dxa"/>
             <w:tcBorders>
@@ -1498,6 +1508,15 @@
           </w:p>
         </w:tc>
         <w:tc>
+          <w:p>
+            <w:r>
+              <w:rPr>
+                <w:b/>
+                <w:rFonts w:ascii="Times New Roman" w:hAnsi="Times New Roman"/>
+              </w:rPr>
+              <w:t>{{NAMA_SEKRETARIS}}</w:t>
+            </w:r>
+          </w:p>
           <w:tcPr>
             <w:tcW w:w="4600" w:type="dxa"/>
             <w:tcBorders>

</xml_diff>

<commit_message>
fix: pengesahan layout, title-case names, detail laporan names, logo position
- Move {{NAMA_KETUA/SEKRETARIS}} to below 'PK IMM FTIK UMKO' in template
- Change name format from upper() to title() (Title Case)
- Add name replacements to _build_detail_docx for per-person reports
- Move header logos up by 350000 EMU to reduce text overlap
</commit_message>
<xml_diff>
--- a/templates/laporan_template/Template_Laporan.docx
+++ b/templates/laporan_template/Template_Laporan.docx
@@ -1446,15 +1446,6 @@
       </w:tblGrid>
       <w:tr>
         <w:tc>
-          <w:p>
-            <w:r>
-              <w:rPr>
-                <w:b/>
-                <w:rFonts w:ascii="Times New Roman" w:hAnsi="Times New Roman"/>
-              </w:rPr>
-              <w:t>{{NAMA_KETUA}}</w:t>
-            </w:r>
-          </w:p>
           <w:tcPr>
             <w:tcW w:w="4600" w:type="dxa"/>
             <w:tcBorders>
@@ -1498,6 +1489,19 @@
           </w:p>
           <w:p>
             <w:pPr>
+              <w:jc w:val="center"/>
+            </w:pPr>
+            <w:r>
+              <w:rPr>
+                <w:b/>
+                <w:rFonts w:ascii="Times New Roman" w:hAnsi="Times New Roman"/>
+                <w:sz w:val="22"/>
+              </w:rPr>
+              <w:t>{{NAMA_KETUA}}</w:t>
+            </w:r>
+          </w:p>
+          <w:p>
+            <w:pPr>
               <w:spacing w:after="80"/>
             </w:pPr>
           </w:p>
@@ -1508,15 +1512,6 @@
           </w:p>
         </w:tc>
         <w:tc>
-          <w:p>
-            <w:r>
-              <w:rPr>
-                <w:b/>
-                <w:rFonts w:ascii="Times New Roman" w:hAnsi="Times New Roman"/>
-              </w:rPr>
-              <w:t>{{NAMA_SEKRETARIS}}</w:t>
-            </w:r>
-          </w:p>
           <w:tcPr>
             <w:tcW w:w="4600" w:type="dxa"/>
             <w:tcBorders>
@@ -1556,6 +1551,19 @@
                 <w:szCs w:val="22"/>
               </w:rPr>
               <w:t>PK IMM FTIK UMKO</w:t>
+            </w:r>
+          </w:p>
+          <w:p>
+            <w:pPr>
+              <w:jc w:val="center"/>
+            </w:pPr>
+            <w:r>
+              <w:rPr>
+                <w:b/>
+                <w:rFonts w:ascii="Times New Roman" w:hAnsi="Times New Roman"/>
+                <w:sz w:val="22"/>
+              </w:rPr>
+              <w:t>{{NAMA_SEKRETARIS}}</w:t>
             </w:r>
           </w:p>
           <w:p>
@@ -1749,7 +1757,7 @@
             <wp:posOffset>-150495</wp:posOffset>
           </wp:positionH>
           <wp:positionV relativeFrom="paragraph">
-            <wp:posOffset>-7620</wp:posOffset>
+            <wp:posOffset>-357620</wp:posOffset>
           </wp:positionV>
           <wp:extent cx="956945" cy="1009015"/>
           <wp:effectExtent l="0" t="0" r="0" b="635"/>
@@ -1812,7 +1820,7 @@
             <wp:posOffset>4975225</wp:posOffset>
           </wp:positionH>
           <wp:positionV relativeFrom="paragraph">
-            <wp:posOffset>-13970</wp:posOffset>
+            <wp:posOffset>-363970</wp:posOffset>
           </wp:positionV>
           <wp:extent cx="914400" cy="956945"/>
           <wp:effectExtent l="0" t="0" r="0" b="0"/>

</xml_diff>

<commit_message>
fix: add signature space in pengesahan, title-case all names in laporan tables
- Add 3 empty lines between 'PK IMM FTIK UMKO' and signer name for stamp space
- Apply .title() to all nama_lengkap in PDF/Excel table data and detail rows
</commit_message>
<xml_diff>
--- a/templates/laporan_template/Template_Laporan.docx
+++ b/templates/laporan_template/Template_Laporan.docx
@@ -1491,6 +1491,21 @@
             <w:pPr>
               <w:jc w:val="center"/>
             </w:pPr>
+          </w:p>
+          <w:p>
+            <w:pPr>
+              <w:jc w:val="center"/>
+            </w:pPr>
+          </w:p>
+          <w:p>
+            <w:pPr>
+              <w:jc w:val="center"/>
+            </w:pPr>
+          </w:p>
+          <w:p>
+            <w:pPr>
+              <w:jc w:val="center"/>
+            </w:pPr>
             <w:r>
               <w:rPr>
                 <w:b/>
@@ -1552,6 +1567,21 @@
               </w:rPr>
               <w:t>PK IMM FTIK UMKO</w:t>
             </w:r>
+          </w:p>
+          <w:p>
+            <w:pPr>
+              <w:jc w:val="center"/>
+            </w:pPr>
+          </w:p>
+          <w:p>
+            <w:pPr>
+              <w:jc w:val="center"/>
+            </w:pPr>
+          </w:p>
+          <w:p>
+            <w:pPr>
+              <w:jc w:val="center"/>
+            </w:pPr>
           </w:p>
           <w:p>
             <w:pPr>

</xml_diff>